<commit_message>
docs: finalize camera-ready author block
Affiliation set to "AJACE Inc, United States" (no street address) and
contributing-author emails added; all placeholder highlight marks
stripped document-wide. PDF regenerated, 20 pages, validation clean.

Co-Authored-By: Claude Fable 5 <noreply@anthropic.com>
</commit_message>
<xml_diff>
--- a/EchoMind_QASC2026_CameraReady_v3.docx
+++ b/EchoMind_QASC2026_CameraReady_v3.docx
@@ -95,17 +95,14 @@
           <w:sz w:val="18"/>
           <w:szCs w:val="18"/>
         </w:rPr>
-        <w:t xml:space="preserve"> AJACE Inc., </w:t>
+        <w:t xml:space="preserve"> AJACE Inc, United States</w:t>
       </w:r>
       <w:r>
         <w:rPr>
           <w:rFonts w:ascii="Times New Roman" w:cs="Times New Roman" w:eastAsia="Times New Roman" w:hAnsi="Times New Roman"/>
           <w:sz w:val="18"/>
           <w:szCs w:val="18"/>
-          <w:highlight w:val="yellow"/>
-          <w:highlightCs w:val="yellow"/>
-        </w:rPr>
-        <w:t xml:space="preserve">[STREET ADDRESS], [CITY], [STATE ZIP]</w:t>
+        </w:rPr>
       </w:r>
       <w:r>
         <w:rPr>
@@ -113,7 +110,6 @@
           <w:sz w:val="18"/>
           <w:szCs w:val="18"/>
         </w:rPr>
-        <w:t xml:space="preserve">, United States</w:t>
       </w:r>
     </w:p>
     <w:p>
@@ -127,16 +123,14 @@
           <w:sz w:val="18"/>
           <w:szCs w:val="18"/>
         </w:rPr>
-        <w:t xml:space="preserve">Corresponding author: </w:t>
+        <w:t>Contributing authors: alexander.peter@gmail.com; preetham.ganesh2015@gmail.com; richardwatson252331@gmail.com</w:t>
       </w:r>
       <w:r>
         <w:rPr>
           <w:rFonts w:ascii="Times New Roman" w:cs="Times New Roman" w:eastAsia="Times New Roman" w:hAnsi="Times New Roman"/>
           <w:sz w:val="18"/>
           <w:szCs w:val="18"/>
-          <w:highlightCs w:val="yellow"/>
-        </w:rPr>
-        <w:t>info@ajace.com</w:t>
+        </w:rPr>
       </w:r>
     </w:p>
     <w:p>
@@ -6440,7 +6434,6 @@
                 <w:iCs w:val="false"/>
                 <w:sz w:val="17"/>
                 <w:szCs w:val="17"/>
-                <w:highlightCs w:val="yellow"/>
               </w:rPr>
               <w:t>n.m.</w:t>
             </w:r>
@@ -6470,7 +6463,6 @@
                 <w:iCs w:val="false"/>
                 <w:sz w:val="17"/>
                 <w:szCs w:val="17"/>
-                <w:highlightCs w:val="yellow"/>
               </w:rPr>
               <w:t>n.m.</w:t>
             </w:r>
@@ -6500,7 +6492,6 @@
                 <w:iCs w:val="false"/>
                 <w:sz w:val="17"/>
                 <w:szCs w:val="17"/>
-                <w:highlightCs w:val="yellow"/>
               </w:rPr>
               <w:t>n.m.</w:t>
             </w:r>
@@ -6530,7 +6521,6 @@
                 <w:iCs w:val="false"/>
                 <w:sz w:val="17"/>
                 <w:szCs w:val="17"/>
-                <w:highlightCs w:val="yellow"/>
               </w:rPr>
               <w:t>voice service; not separately instrumented</w:t>
             </w:r>
@@ -6594,7 +6584,6 @@
                 <w:iCs w:val="false"/>
                 <w:sz w:val="17"/>
                 <w:szCs w:val="17"/>
-                <w:highlightCs w:val="yellow"/>
               </w:rPr>
               <w:t>n.m.</w:t>
             </w:r>
@@ -6624,7 +6613,6 @@
                 <w:iCs w:val="false"/>
                 <w:sz w:val="17"/>
                 <w:szCs w:val="17"/>
-                <w:highlightCs w:val="yellow"/>
               </w:rPr>
               <w:t>n.m.</w:t>
             </w:r>
@@ -6654,7 +6642,6 @@
                 <w:iCs w:val="false"/>
                 <w:sz w:val="17"/>
                 <w:szCs w:val="17"/>
-                <w:highlightCs w:val="yellow"/>
               </w:rPr>
               <w:t>n.m.</w:t>
             </w:r>
@@ -6684,7 +6671,6 @@
                 <w:iCs w:val="false"/>
                 <w:sz w:val="17"/>
                 <w:szCs w:val="17"/>
-                <w:highlightCs w:val="yellow"/>
               </w:rPr>
               <w:t>streaming partials, 560 ms windows</w:t>
             </w:r>
@@ -6748,7 +6734,6 @@
                 <w:iCs w:val="false"/>
                 <w:sz w:val="17"/>
                 <w:szCs w:val="17"/>
-                <w:highlightCs w:val="yellow"/>
               </w:rPr>
               <w:t>636</w:t>
             </w:r>
@@ -6778,7 +6763,6 @@
                 <w:iCs w:val="false"/>
                 <w:sz w:val="17"/>
                 <w:szCs w:val="17"/>
-                <w:highlightCs w:val="yellow"/>
               </w:rPr>
               <w:t>894</w:t>
             </w:r>
@@ -6808,7 +6792,6 @@
                 <w:iCs w:val="false"/>
                 <w:sz w:val="17"/>
                 <w:szCs w:val="17"/>
-                <w:highlightCs w:val="yellow"/>
               </w:rPr>
               <w:t>n.m.</w:t>
             </w:r>
@@ -6838,7 +6821,6 @@
                 <w:iCs w:val="false"/>
                 <w:sz w:val="17"/>
                 <w:szCs w:val="17"/>
-                <w:highlightCs w:val="yellow"/>
               </w:rPr>
               <w:t>voice loop, end of user speech to first audio; n = 10 (Sect. 8.2)</w:t>
             </w:r>
@@ -6902,7 +6884,6 @@
                 <w:iCs w:val="false"/>
                 <w:sz w:val="17"/>
                 <w:szCs w:val="17"/>
-                <w:highlightCs w:val="yellow"/>
               </w:rPr>
               <w:t>0.01</w:t>
             </w:r>
@@ -6932,7 +6913,6 @@
                 <w:iCs w:val="false"/>
                 <w:sz w:val="17"/>
                 <w:szCs w:val="17"/>
-                <w:highlightCs w:val="yellow"/>
               </w:rPr>
               <w:t>37.9</w:t>
             </w:r>
@@ -6962,7 +6942,6 @@
                 <w:iCs w:val="false"/>
                 <w:sz w:val="17"/>
                 <w:szCs w:val="17"/>
-                <w:highlightCs w:val="yellow"/>
               </w:rPr>
               <w:t>39.5</w:t>
             </w:r>
@@ -6992,7 +6971,6 @@
                 <w:iCs w:val="false"/>
                 <w:sz w:val="17"/>
                 <w:szCs w:val="17"/>
-                <w:highlightCs w:val="yellow"/>
               </w:rPr>
               <w:t>warm client; first call pays model load</w:t>
             </w:r>
@@ -7056,7 +7034,6 @@
                 <w:iCs w:val="false"/>
                 <w:sz w:val="17"/>
                 <w:szCs w:val="17"/>
-                <w:highlightCs w:val="yellow"/>
               </w:rPr>
               <w:t>0.08</w:t>
             </w:r>
@@ -7086,7 +7063,6 @@
                 <w:iCs w:val="false"/>
                 <w:sz w:val="17"/>
                 <w:szCs w:val="17"/>
-                <w:highlightCs w:val="yellow"/>
               </w:rPr>
               <w:t>0.17</w:t>
             </w:r>
@@ -7116,7 +7092,6 @@
                 <w:iCs w:val="false"/>
                 <w:sz w:val="17"/>
                 <w:szCs w:val="17"/>
-                <w:highlightCs w:val="yellow"/>
               </w:rPr>
               <w:t>0.18</w:t>
             </w:r>
@@ -7146,7 +7121,6 @@
                 <w:iCs w:val="false"/>
                 <w:sz w:val="17"/>
                 <w:szCs w:val="17"/>
-                <w:highlightCs w:val="yellow"/>
               </w:rPr>
               <w:t>evaluated inside the candidate scan (P1)</w:t>
             </w:r>
@@ -7210,7 +7184,6 @@
                 <w:iCs w:val="false"/>
                 <w:sz w:val="17"/>
                 <w:szCs w:val="17"/>
-                <w:highlightCs w:val="yellow"/>
               </w:rPr>
               <w:t>34.7</w:t>
             </w:r>
@@ -7240,7 +7213,6 @@
                 <w:iCs w:val="false"/>
                 <w:sz w:val="17"/>
                 <w:szCs w:val="17"/>
-                <w:highlightCs w:val="yellow"/>
               </w:rPr>
               <w:t>43.3</w:t>
             </w:r>
@@ -7270,7 +7242,6 @@
                 <w:iCs w:val="false"/>
                 <w:sz w:val="17"/>
                 <w:szCs w:val="17"/>
-                <w:highlightCs w:val="yellow"/>
               </w:rPr>
               <w:t>46.7</w:t>
             </w:r>
@@ -7300,7 +7271,6 @@
                 <w:iCs w:val="false"/>
                 <w:sz w:val="17"/>
                 <w:szCs w:val="17"/>
-                <w:highlightCs w:val="yellow"/>
               </w:rPr>
               <w:t>17,514 chunks</w:t>
             </w:r>
@@ -7364,7 +7334,6 @@
                 <w:iCs w:val="false"/>
                 <w:sz w:val="17"/>
                 <w:szCs w:val="17"/>
-                <w:highlightCs w:val="yellow"/>
               </w:rPr>
               <w:t>42.7</w:t>
             </w:r>
@@ -7394,7 +7363,6 @@
                 <w:iCs w:val="false"/>
                 <w:sz w:val="17"/>
                 <w:szCs w:val="17"/>
-                <w:highlightCs w:val="yellow"/>
               </w:rPr>
               <w:t>59.6</w:t>
             </w:r>
@@ -7424,7 +7392,6 @@
                 <w:iCs w:val="false"/>
                 <w:sz w:val="17"/>
                 <w:szCs w:val="17"/>
-                <w:highlightCs w:val="yellow"/>
               </w:rPr>
               <w:t>75.8</w:t>
             </w:r>
@@ -7454,7 +7421,6 @@
                 <w:iCs w:val="false"/>
                 <w:sz w:val="17"/>
                 <w:szCs w:val="17"/>
-                <w:highlightCs w:val="yellow"/>
               </w:rPr>
             </w:r>
           </w:p>
@@ -7517,7 +7483,6 @@
                 <w:iCs w:val="false"/>
                 <w:sz w:val="17"/>
                 <w:szCs w:val="17"/>
-                <w:highlightCs w:val="yellow"/>
               </w:rPr>
               <w:t>14.2</w:t>
             </w:r>
@@ -7547,7 +7512,6 @@
                 <w:iCs w:val="false"/>
                 <w:sz w:val="17"/>
                 <w:szCs w:val="17"/>
-                <w:highlightCs w:val="yellow"/>
               </w:rPr>
               <w:t>32.2</w:t>
             </w:r>
@@ -7577,7 +7541,6 @@
                 <w:iCs w:val="false"/>
                 <w:sz w:val="17"/>
                 <w:szCs w:val="17"/>
-                <w:highlightCs w:val="yellow"/>
               </w:rPr>
               <w:t>40.4</w:t>
             </w:r>
@@ -7607,7 +7570,6 @@
                 <w:iCs w:val="false"/>
                 <w:sz w:val="17"/>
                 <w:szCs w:val="17"/>
-                <w:highlightCs w:val="yellow"/>
               </w:rPr>
               <w:t>top 25 kept 15; n = 26</w:t>
             </w:r>
@@ -7671,7 +7633,6 @@
                 <w:iCs w:val="false"/>
                 <w:sz w:val="17"/>
                 <w:szCs w:val="17"/>
-                <w:highlightCs w:val="yellow"/>
               </w:rPr>
               <w:t>2.03</w:t>
             </w:r>
@@ -7701,7 +7662,6 @@
                 <w:iCs w:val="false"/>
                 <w:sz w:val="17"/>
                 <w:szCs w:val="17"/>
-                <w:highlightCs w:val="yellow"/>
               </w:rPr>
               <w:t>6.59</w:t>
             </w:r>
@@ -7731,7 +7691,6 @@
                 <w:iCs w:val="false"/>
                 <w:sz w:val="17"/>
                 <w:szCs w:val="17"/>
-                <w:highlightCs w:val="yellow"/>
               </w:rPr>
               <w:t>7.00</w:t>
             </w:r>
@@ -7761,7 +7720,6 @@
                 <w:iCs w:val="false"/>
                 <w:sz w:val="17"/>
                 <w:szCs w:val="17"/>
-                <w:highlightCs w:val="yellow"/>
               </w:rPr>
               <w:t>dedup, envelopes, citations</w:t>
             </w:r>
@@ -7825,7 +7783,6 @@
                 <w:iCs w:val="false"/>
                 <w:sz w:val="17"/>
                 <w:szCs w:val="17"/>
-                <w:highlightCs w:val="yellow"/>
               </w:rPr>
               <w:t>—</w:t>
             </w:r>
@@ -7855,7 +7812,6 @@
                 <w:iCs w:val="false"/>
                 <w:sz w:val="17"/>
                 <w:szCs w:val="17"/>
-                <w:highlightCs w:val="yellow"/>
               </w:rPr>
               <w:t>—</w:t>
             </w:r>
@@ -7885,7 +7841,6 @@
                 <w:iCs w:val="false"/>
                 <w:sz w:val="17"/>
                 <w:szCs w:val="17"/>
-                <w:highlightCs w:val="yellow"/>
               </w:rPr>
               <w:t>—</w:t>
             </w:r>
@@ -7915,7 +7870,6 @@
                 <w:iCs w:val="false"/>
                 <w:sz w:val="17"/>
                 <w:szCs w:val="17"/>
-                <w:highlightCs w:val="yellow"/>
               </w:rPr>
               <w:t>not separately spanned; residual ≈ 97% of Tgrounded (Sect. 8.1)</w:t>
             </w:r>
@@ -7979,7 +7933,6 @@
                 <w:iCs w:val="false"/>
                 <w:sz w:val="17"/>
                 <w:szCs w:val="17"/>
-                <w:highlightCs w:val="yellow"/>
               </w:rPr>
               <w:t>n.m.</w:t>
             </w:r>
@@ -8009,7 +7962,6 @@
                 <w:iCs w:val="false"/>
                 <w:sz w:val="17"/>
                 <w:szCs w:val="17"/>
-                <w:highlightCs w:val="yellow"/>
               </w:rPr>
               <w:t>n.m.</w:t>
             </w:r>
@@ -8039,7 +7991,6 @@
                 <w:iCs w:val="false"/>
                 <w:sz w:val="17"/>
                 <w:szCs w:val="17"/>
-                <w:highlightCs w:val="yellow"/>
               </w:rPr>
               <w:t>n.m.</w:t>
             </w:r>
@@ -8069,7 +8020,6 @@
                 <w:iCs w:val="false"/>
                 <w:sz w:val="17"/>
                 <w:szCs w:val="17"/>
-                <w:highlightCs w:val="yellow"/>
               </w:rPr>
               <w:t>contained within Tfirst</w:t>
             </w:r>
@@ -8133,7 +8083,6 @@
                 <w:iCs w:val="false"/>
                 <w:sz w:val="17"/>
                 <w:szCs w:val="17"/>
-                <w:highlightCs w:val="yellow"/>
               </w:rPr>
               <w:t>3,313</w:t>
             </w:r>
@@ -8163,7 +8112,6 @@
                 <w:iCs w:val="false"/>
                 <w:sz w:val="17"/>
                 <w:szCs w:val="17"/>
-                <w:highlightCs w:val="yellow"/>
               </w:rPr>
               <w:t>15,171</w:t>
             </w:r>
@@ -8193,7 +8141,6 @@
                 <w:iCs w:val="false"/>
                 <w:sz w:val="17"/>
                 <w:szCs w:val="17"/>
-                <w:highlightCs w:val="yellow"/>
               </w:rPr>
               <w:t>18,441</w:t>
             </w:r>
@@ -8223,7 +8170,6 @@
                 <w:iCs w:val="false"/>
                 <w:sz w:val="17"/>
                 <w:szCs w:val="17"/>
-                <w:highlightCs w:val="yellow"/>
               </w:rPr>
               <w:t>in-process text RAG path</w:t>
             </w:r>
@@ -8287,7 +8233,6 @@
                 <w:iCs w:val="false"/>
                 <w:sz w:val="17"/>
                 <w:szCs w:val="17"/>
-                <w:highlightCs w:val="yellow"/>
               </w:rPr>
               <w:t>2,131</w:t>
             </w:r>
@@ -8317,7 +8262,6 @@
                 <w:iCs w:val="false"/>
                 <w:sz w:val="17"/>
                 <w:szCs w:val="17"/>
-                <w:highlightCs w:val="yellow"/>
               </w:rPr>
               <w:t>2,141</w:t>
             </w:r>
@@ -8347,7 +8291,6 @@
                 <w:iCs w:val="false"/>
                 <w:sz w:val="17"/>
                 <w:szCs w:val="17"/>
-                <w:highlightCs w:val="yellow"/>
               </w:rPr>
               <w:t>n.m.</w:t>
             </w:r>
@@ -8377,7 +8320,6 @@
                 <w:iCs w:val="false"/>
                 <w:sz w:val="17"/>
                 <w:szCs w:val="17"/>
-                <w:highlightCs w:val="yellow"/>
               </w:rPr>
               <w:t>onset of user speech to last audio frame; includes ~160 ms VAD lead-in; n = 8</w:t>
             </w:r>
@@ -8758,7 +8700,6 @@
                 <w:iCs w:val="false"/>
                 <w:sz w:val="17"/>
                 <w:szCs w:val="17"/>
-                <w:highlightCs w:val="yellow"/>
               </w:rPr>
               <w:t>3,313</w:t>
             </w:r>
@@ -8788,7 +8729,6 @@
                 <w:iCs w:val="false"/>
                 <w:sz w:val="17"/>
                 <w:szCs w:val="17"/>
-                <w:highlightCs w:val="yellow"/>
               </w:rPr>
               <w:t>15,171</w:t>
             </w:r>
@@ -8818,7 +8758,6 @@
                 <w:iCs w:val="false"/>
                 <w:sz w:val="17"/>
                 <w:szCs w:val="17"/>
-                <w:highlightCs w:val="yellow"/>
               </w:rPr>
               <w:t>2.8%</w:t>
             </w:r>
@@ -8848,7 +8787,6 @@
                 <w:iCs w:val="false"/>
                 <w:sz w:val="17"/>
                 <w:szCs w:val="17"/>
-                <w:highlightCs w:val="yellow"/>
               </w:rPr>
               <w:t>14.2</w:t>
             </w:r>
@@ -8912,7 +8850,6 @@
                 <w:iCs w:val="false"/>
                 <w:sz w:val="17"/>
                 <w:szCs w:val="17"/>
-                <w:highlightCs w:val="yellow"/>
               </w:rPr>
               <w:t>4,130</w:t>
             </w:r>
@@ -8942,7 +8879,6 @@
                 <w:iCs w:val="false"/>
                 <w:sz w:val="17"/>
                 <w:szCs w:val="17"/>
-                <w:highlightCs w:val="yellow"/>
               </w:rPr>
               <w:t>14,092</w:t>
             </w:r>
@@ -8972,7 +8908,6 @@
                 <w:iCs w:val="false"/>
                 <w:sz w:val="17"/>
                 <w:szCs w:val="17"/>
-                <w:highlightCs w:val="yellow"/>
               </w:rPr>
               <w:t>6.6%</w:t>
             </w:r>
@@ -9002,7 +8937,6 @@
                 <w:iCs w:val="false"/>
                 <w:sz w:val="17"/>
                 <w:szCs w:val="17"/>
-                <w:highlightCs w:val="yellow"/>
               </w:rPr>
               <w:t>96.5</w:t>
             </w:r>
@@ -9066,7 +9000,6 @@
                 <w:iCs w:val="false"/>
                 <w:sz w:val="17"/>
                 <w:szCs w:val="17"/>
-                <w:highlightCs w:val="yellow"/>
               </w:rPr>
               <w:t>8,432</w:t>
             </w:r>
@@ -9096,7 +9029,6 @@
                 <w:iCs w:val="false"/>
                 <w:sz w:val="17"/>
                 <w:szCs w:val="17"/>
-                <w:highlightCs w:val="yellow"/>
               </w:rPr>
               <w:t>21,321</w:t>
             </w:r>
@@ -9126,7 +9058,6 @@
                 <w:iCs w:val="false"/>
                 <w:sz w:val="17"/>
                 <w:szCs w:val="17"/>
-                <w:highlightCs w:val="yellow"/>
               </w:rPr>
               <w:t>9.5%</w:t>
             </w:r>
@@ -9156,7 +9087,6 @@
                 <w:iCs w:val="false"/>
                 <w:sz w:val="17"/>
                 <w:szCs w:val="17"/>
-                <w:highlightCs w:val="yellow"/>
               </w:rPr>
               <w:t>567.9</w:t>
             </w:r>
@@ -9497,7 +9427,6 @@
                 <w:iCs w:val="false"/>
                 <w:sz w:val="17"/>
                 <w:szCs w:val="17"/>
-                <w:highlightCs w:val="yellow"/>
               </w:rPr>
               <w:t>635.8</w:t>
             </w:r>
@@ -9527,7 +9456,6 @@
                 <w:iCs w:val="false"/>
                 <w:sz w:val="17"/>
                 <w:szCs w:val="17"/>
-                <w:highlightCs w:val="yellow"/>
               </w:rPr>
               <w:t>894.0</w:t>
             </w:r>
@@ -9557,7 +9485,6 @@
                 <w:iCs w:val="false"/>
                 <w:sz w:val="17"/>
                 <w:szCs w:val="17"/>
-                <w:highlightCs w:val="yellow"/>
               </w:rPr>
               <w:t>642.6</w:t>
             </w:r>
@@ -9587,7 +9514,6 @@
                 <w:iCs w:val="false"/>
                 <w:sz w:val="17"/>
                 <w:szCs w:val="17"/>
-                <w:highlightCs w:val="yellow"/>
               </w:rPr>
               <w:t>0/10</w:t>
             </w:r>
@@ -9617,7 +9543,6 @@
                 <w:iCs w:val="false"/>
                 <w:sz w:val="17"/>
                 <w:szCs w:val="17"/>
-                <w:highlightCs w:val="yellow"/>
               </w:rPr>
               <w:t>0.00 [0.00, 0.28]</w:t>
             </w:r>
@@ -9681,7 +9606,6 @@
                 <w:iCs w:val="false"/>
                 <w:sz w:val="17"/>
                 <w:szCs w:val="17"/>
-                <w:highlightCs w:val="yellow"/>
               </w:rPr>
               <w:t>865.8</w:t>
             </w:r>
@@ -9711,7 +9635,6 @@
                 <w:iCs w:val="false"/>
                 <w:sz w:val="17"/>
                 <w:szCs w:val="17"/>
-                <w:highlightCs w:val="yellow"/>
               </w:rPr>
               <w:t>1,208.8</w:t>
             </w:r>
@@ -9741,7 +9664,6 @@
                 <w:iCs w:val="false"/>
                 <w:sz w:val="17"/>
                 <w:szCs w:val="17"/>
-                <w:highlightCs w:val="yellow"/>
               </w:rPr>
               <w:t>689.5</w:t>
             </w:r>
@@ -9771,7 +9693,6 @@
                 <w:iCs w:val="false"/>
                 <w:sz w:val="17"/>
                 <w:szCs w:val="17"/>
-                <w:highlightCs w:val="yellow"/>
               </w:rPr>
               <w:t>n/a</w:t>
             </w:r>
@@ -9801,7 +9722,6 @@
                 <w:iCs w:val="false"/>
                 <w:sz w:val="17"/>
                 <w:szCs w:val="17"/>
-                <w:highlightCs w:val="yellow"/>
               </w:rPr>
               <w:t>no LI utterances</w:t>
             </w:r>
@@ -9865,7 +9785,6 @@
                 <w:iCs w:val="false"/>
                 <w:sz w:val="17"/>
                 <w:szCs w:val="17"/>
-                <w:highlightCs w:val="yellow"/>
               </w:rPr>
               <w:t>750.9</w:t>
             </w:r>
@@ -9895,7 +9814,6 @@
                 <w:iCs w:val="false"/>
                 <w:sz w:val="17"/>
                 <w:szCs w:val="17"/>
-                <w:highlightCs w:val="yellow"/>
               </w:rPr>
               <w:t>1,040.5</w:t>
             </w:r>
@@ -9925,7 +9843,6 @@
                 <w:iCs w:val="false"/>
                 <w:sz w:val="17"/>
                 <w:szCs w:val="17"/>
-                <w:highlightCs w:val="yellow"/>
               </w:rPr>
               <w:t>641.9</w:t>
             </w:r>
@@ -9955,7 +9872,6 @@
                 <w:iCs w:val="false"/>
                 <w:sz w:val="17"/>
                 <w:szCs w:val="17"/>
-                <w:highlightCs w:val="yellow"/>
               </w:rPr>
               <w:t>10/10</w:t>
             </w:r>
@@ -9985,7 +9901,6 @@
                 <w:iCs w:val="false"/>
                 <w:sz w:val="17"/>
                 <w:szCs w:val="17"/>
-                <w:highlightCs w:val="yellow"/>
               </w:rPr>
               <w:t>1.00 [0.72, 1.00]</w:t>
             </w:r>
@@ -10224,7 +10139,6 @@
                 <w:iCs w:val="false"/>
                 <w:sz w:val="17"/>
                 <w:szCs w:val="17"/>
-                <w:highlightCs w:val="yellow"/>
               </w:rPr>
               <w:t>0/50; CI [0, 0.071]</w:t>
             </w:r>
@@ -10288,7 +10202,6 @@
                 <w:iCs w:val="false"/>
                 <w:sz w:val="17"/>
                 <w:szCs w:val="17"/>
-                <w:highlightCs w:val="yellow"/>
               </w:rPr>
               <w:t>0/359 inspected hits</w:t>
             </w:r>
@@ -10352,7 +10265,6 @@
                 <w:iCs w:val="false"/>
                 <w:sz w:val="17"/>
                 <w:szCs w:val="17"/>
-                <w:highlightCs w:val="yellow"/>
               </w:rPr>
               <w:t>0/50</w:t>
             </w:r>
@@ -10416,7 +10328,6 @@
                 <w:iCs w:val="false"/>
                 <w:sz w:val="17"/>
                 <w:szCs w:val="17"/>
-                <w:highlightCs w:val="yellow"/>
               </w:rPr>
               <w:t>KS 0.54, p ≈ 2×10⁻⁶ — open</w:t>
             </w:r>
@@ -10480,7 +10391,6 @@
                 <w:iCs w:val="false"/>
                 <w:sz w:val="17"/>
                 <w:szCs w:val="17"/>
-                <w:highlightCs w:val="yellow"/>
               </w:rPr>
               <w:t>0.979 [0.938, 1.00]  /  0.826 [0.713, 0.938]</w:t>
             </w:r>
@@ -10544,7 +10454,6 @@
                 <w:iCs w:val="false"/>
                 <w:sz w:val="17"/>
                 <w:szCs w:val="17"/>
-                <w:highlightCs w:val="yellow"/>
               </w:rPr>
               <w:t>0.815 (75/92 fact groups)</w:t>
             </w:r>
@@ -10608,7 +10517,6 @@
                 <w:iCs w:val="false"/>
                 <w:sz w:val="17"/>
                 <w:szCs w:val="17"/>
-                <w:highlightCs w:val="yellow"/>
               </w:rPr>
               <w:t>18/23 = 0.783 [0.581, 0.903]</w:t>
             </w:r>
@@ -10672,7 +10580,6 @@
                 <w:iCs w:val="false"/>
                 <w:sz w:val="17"/>
                 <w:szCs w:val="17"/>
-                <w:highlightCs w:val="yellow"/>
               </w:rPr>
               <w:t>0/23</w:t>
             </w:r>
@@ -10983,7 +10890,6 @@
                 <w:iCs w:val="false"/>
                 <w:sz w:val="17"/>
                 <w:szCs w:val="17"/>
-                <w:highlightCs w:val="yellow"/>
               </w:rPr>
               <w:t>10.2% [5.6, 17.8]</w:t>
             </w:r>
@@ -11013,7 +10919,6 @@
                 <w:iCs w:val="false"/>
                 <w:sz w:val="17"/>
                 <w:szCs w:val="17"/>
-                <w:highlightCs w:val="yellow"/>
               </w:rPr>
               <w:t>89.8%</w:t>
             </w:r>
@@ -11043,7 +10948,6 @@
                 <w:iCs w:val="false"/>
                 <w:sz w:val="17"/>
                 <w:szCs w:val="17"/>
-                <w:highlightCs w:val="yellow"/>
               </w:rPr>
               <w:t>0.0%</w:t>
             </w:r>
@@ -11073,7 +10977,6 @@
                 <w:iCs w:val="false"/>
                 <w:sz w:val="17"/>
                 <w:szCs w:val="17"/>
-                <w:highlightCs w:val="yellow"/>
               </w:rPr>
               <w:t>0/25</w:t>
             </w:r>
@@ -11137,7 +11040,6 @@
                 <w:iCs w:val="false"/>
                 <w:sz w:val="17"/>
                 <w:szCs w:val="17"/>
-                <w:highlightCs w:val="yellow"/>
               </w:rPr>
               <w:t>11.2% [6.4, 19.0]</w:t>
             </w:r>
@@ -11167,7 +11069,6 @@
                 <w:iCs w:val="false"/>
                 <w:sz w:val="17"/>
                 <w:szCs w:val="17"/>
-                <w:highlightCs w:val="yellow"/>
               </w:rPr>
               <w:t>88.8%</w:t>
             </w:r>
@@ -11197,7 +11098,6 @@
                 <w:iCs w:val="false"/>
                 <w:sz w:val="17"/>
                 <w:szCs w:val="17"/>
-                <w:highlightCs w:val="yellow"/>
               </w:rPr>
               <w:t>0.0%</w:t>
             </w:r>
@@ -11227,7 +11127,6 @@
                 <w:iCs w:val="false"/>
                 <w:sz w:val="17"/>
                 <w:szCs w:val="17"/>
-                <w:highlightCs w:val="yellow"/>
               </w:rPr>
               <w:t>0/25</w:t>
             </w:r>
@@ -11291,7 +11190,6 @@
                 <w:iCs w:val="false"/>
                 <w:sz w:val="17"/>
                 <w:szCs w:val="17"/>
-                <w:highlightCs w:val="yellow"/>
               </w:rPr>
               <w:t>5.1% [2.2, 11.4]</w:t>
             </w:r>
@@ -11321,7 +11219,6 @@
                 <w:iCs w:val="false"/>
                 <w:sz w:val="17"/>
                 <w:szCs w:val="17"/>
-                <w:highlightCs w:val="yellow"/>
               </w:rPr>
               <w:t>94.9%</w:t>
             </w:r>
@@ -11351,7 +11248,6 @@
                 <w:iCs w:val="false"/>
                 <w:sz w:val="17"/>
                 <w:szCs w:val="17"/>
-                <w:highlightCs w:val="yellow"/>
               </w:rPr>
               <w:t>0.0%</w:t>
             </w:r>
@@ -11381,7 +11277,6 @@
                 <w:iCs w:val="false"/>
                 <w:sz w:val="17"/>
                 <w:szCs w:val="17"/>
-                <w:highlightCs w:val="yellow"/>
               </w:rPr>
               <w:t>0/25</w:t>
             </w:r>
@@ -11445,7 +11340,6 @@
                 <w:iCs w:val="false"/>
                 <w:sz w:val="17"/>
                 <w:szCs w:val="17"/>
-                <w:highlightCs w:val="yellow"/>
               </w:rPr>
               <w:t>5.1% [2.2, 11.4]</w:t>
             </w:r>
@@ -11475,7 +11369,6 @@
                 <w:iCs w:val="false"/>
                 <w:sz w:val="17"/>
                 <w:szCs w:val="17"/>
-                <w:highlightCs w:val="yellow"/>
               </w:rPr>
               <w:t>94.9%</w:t>
             </w:r>
@@ -11505,7 +11398,6 @@
                 <w:iCs w:val="false"/>
                 <w:sz w:val="17"/>
                 <w:szCs w:val="17"/>
-                <w:highlightCs w:val="yellow"/>
               </w:rPr>
               <w:t>0.0%</w:t>
             </w:r>
@@ -11535,7 +11427,6 @@
                 <w:iCs w:val="false"/>
                 <w:sz w:val="17"/>
                 <w:szCs w:val="17"/>
-                <w:highlightCs w:val="yellow"/>
               </w:rPr>
               <w:t>0/25</w:t>
             </w:r>

</xml_diff>

<commit_message>
docs: LNEE LaTeX camera-ready + author reorder
Convert the camera-ready to the Springer LNEE (svproc) single-column A4
10pt template: add the compiled LaTeX PDF and the source bundle
(main.tex + svproc.cls + fig1_v2.pdf). Reorder authors to
Peter, Watson, Ganesh in both the LaTeX and the Word versions and
regenerate the docx PDF.

Co-Authored-By: Claude Fable 5 <noreply@anthropic.com>
</commit_message>
<xml_diff>
--- a/EchoMind_QASC2026_CameraReady_v3.docx
+++ b/EchoMind_QASC2026_CameraReady_v3.docx
@@ -29,7 +29,7 @@
           <w:sz w:val="20"/>
           <w:szCs w:val="20"/>
         </w:rPr>
-        <w:t xml:space="preserve">Alexander Peter</w:t>
+        <w:t>Alexander Peter</w:t>
       </w:r>
       <w:r>
         <w:rPr>
@@ -46,7 +46,7 @@
           <w:sz w:val="20"/>
           <w:szCs w:val="20"/>
         </w:rPr>
-        <w:t xml:space="preserve">, Preetham Ganesh</w:t>
+        <w:t>, Richard Watson</w:t>
       </w:r>
       <w:r>
         <w:rPr>
@@ -63,7 +63,7 @@
           <w:sz w:val="20"/>
           <w:szCs w:val="20"/>
         </w:rPr>
-        <w:t xml:space="preserve"> and Richard Watson</w:t>
+        <w:t xml:space="preserve"> and Preetham Ganesh</w:t>
       </w:r>
       <w:r>
         <w:rPr>
@@ -123,7 +123,7 @@
           <w:sz w:val="18"/>
           <w:szCs w:val="18"/>
         </w:rPr>
-        <w:t>Contributing authors: alexander.peter@gmail.com; preetham.ganesh2015@gmail.com; richardwatson252331@gmail.com</w:t>
+        <w:t>Contributing authors: alexander.peter@gmail.com; richardwatson252331@gmail.com; preetham.ganesh2015@gmail.com</w:t>
       </w:r>
       <w:r>
         <w:rPr>

</xml_diff>

<commit_message>
docs: finalize QASC 2026 camera-ready; keep only the final package
Update the camera-ready set to the final, US-English, author-reordered
version (Peter, Watson, Ganesh): LNEE PDF, LaTeX source zip, and the
Word master (docx + pdf). Remove superseded conference files — the v2
manuscript and the response-to-reviewers letter (recoverable from
history).

Co-Authored-By: Claude Fable 5 <noreply@anthropic.com>
</commit_message>
<xml_diff>
--- a/EchoMind_QASC2026_CameraReady_v3.docx
+++ b/EchoMind_QASC2026_CameraReady_v3.docx
@@ -278,7 +278,7 @@
           <w:sz w:val="20"/>
           <w:szCs w:val="20"/>
         </w:rPr>
-        <w:t>This paper contributes a reference architecture, an evaluation methodology, and a measured reference deployment. To keep the status of each claim explicit, we distinguish four categories. Design claims describe how components should be arranged and why; they are argued from the requirements and threat model of Sect. 3. Derived claims, such as the latency decomposition of Sect. 7.2 and the ordering property of Sect. 6.1, follow analytically from the architecture. Measured claims are established on the instrumented deployment of Sect. 7.1 under the protocol of Sect. 7.3 and are reported, with confidence intervals and stated limitations, in Sect. 8 — including two places where measurement contradicted the analytic expectation, which we report unchanged rather than repair. Empirical claims at production scale — behaviour on large private corpora under realistic permission structure and concurrency, and attack success under a sustained red team — remain open; Sect. 11 records them.</w:t>
+        <w:t>This paper contributes a reference architecture, an evaluation methodology, and a measured reference deployment. To keep the status of each claim explicit, we distinguish four categories. Design claims describe how components should be arranged and why; they are argued from the requirements and threat model of Sect. 3. Derived claims, such as the latency decomposition of Sect. 7.2 and the ordering property of Sect. 6.1, follow analytically from the architecture. Measured claims are established on the instrumented deployment of Sect. 7.1 under the protocol of Sect. 7.3 and are reported, with confidence intervals and stated limitations, in Sect. 8 — including two places where measurement contradicted the analytic expectation, which we report unchanged rather than repair. Empirical claims at production scale — behavior on large private corpora under realistic permission structure and concurrency, and attack success under a sustained red team — remain open; Sect. 11 records them.</w:t>
       </w:r>
     </w:p>
     <w:p>
@@ -5880,7 +5880,7 @@
           <w:sz w:val="20"/>
           <w:szCs w:val="20"/>
         </w:rPr>
-        <w:t>Any span originating at T3 or below is rendered into the context inside a delimited evidence envelope carrying its provenance, and imperative content appearing inside an envelope is treated as quoted text to be reported, not as an instruction to be followed. Enforcement does not rest on the generator honoring this framing. Tool-invocation requests emitted while an envelope is in scope must match an allowlist, must use scoped credentials, and, for state-changing calls, must obtain human confirmation. The practical consequence is that a successful injection degrades to a reportable event — the assistant says that a document contains an instruction it will not follow, and the event is logged — rather than to an undetected action. Measurement qualifies the last step: on the reference deployment injections were contained but never reported — the assistant refused without saying so (Sect. 8.4) — so the reportable-event property is currently a design commitment rather than a measured behaviour.</w:t>
+        <w:t>Any span originating at T3 or below is rendered into the context inside a delimited evidence envelope carrying its provenance, and imperative content appearing inside an envelope is treated as quoted text to be reported, not as an instruction to be followed. Enforcement does not rest on the generator honoring this framing. Tool-invocation requests emitted while an envelope is in scope must match an allowlist, must use scoped credentials, and, for state-changing calls, must obtain human confirmation. The practical consequence is that a successful injection degrades to a reportable event — the assistant says that a document contains an instruction it will not follow, and the event is logged — rather than to an undetected action. Measurement qualifies the last step: on the reference deployment injections were contained but never reported — the assistant refused without saying so (Sect. 8.4) — so the reportable-event property is currently a design commitment rather than a measured behavior.</w:t>
       </w:r>
     </w:p>
     <w:p>

</xml_diff>